<commit_message>
fix logging error and fix folder structure
</commit_message>
<xml_diff>
--- a/git-gorupProjects.docx
+++ b/git-gorupProjects.docx
@@ -126,15 +126,7 @@
     </w:p>
     <w:p>
       <w:r>
-        <w:t xml:space="preserve">git </w:t>
-      </w:r>
-      <w:proofErr w:type="gramStart"/>
-      <w:r>
-        <w:t>merge</w:t>
-      </w:r>
-      <w:proofErr w:type="gramEnd"/>
-      <w:r>
-        <w:t xml:space="preserve"> main</w:t>
+        <w:t>git merge main</w:t>
       </w:r>
     </w:p>
     <w:p>
@@ -1790,7 +1782,243 @@
     <w:p/>
     <w:p>
       <w:r>
-        <w:t>netstat -ano | findstr :5000</w:t>
+        <w:t>netstat -</w:t>
+      </w:r>
+      <w:proofErr w:type="spellStart"/>
+      <w:r>
+        <w:t>ano</w:t>
+      </w:r>
+      <w:proofErr w:type="spellEnd"/>
+      <w:r>
+        <w:t xml:space="preserve"> | </w:t>
+      </w:r>
+      <w:proofErr w:type="spellStart"/>
+      <w:r>
+        <w:t>findstr</w:t>
+      </w:r>
+      <w:proofErr w:type="spellEnd"/>
+      <w:r>
+        <w:t xml:space="preserve"> :</w:t>
+      </w:r>
+      <w:r>
+        <w:t>8080</w:t>
+      </w:r>
+    </w:p>
+    <w:p>
+      <w:pPr>
+        <w:rPr>
+          <w:b/>
+          <w:bCs/>
+        </w:rPr>
+      </w:pPr>
+    </w:p>
+    <w:p>
+      <w:pPr>
+        <w:rPr>
+          <w:b/>
+          <w:bCs/>
+        </w:rPr>
+      </w:pPr>
+      <w:r>
+        <w:rPr>
+          <w:b/>
+          <w:bCs/>
+        </w:rPr>
+        <w:t># 1. Sync main and merge into your feature branch (daily / before coding)</w:t>
+      </w:r>
+    </w:p>
+    <w:p>
+      <w:r>
+        <w:t>git checkout main</w:t>
+      </w:r>
+    </w:p>
+    <w:p>
+      <w:r>
+        <w:t>git pull origin main</w:t>
+      </w:r>
+    </w:p>
+    <w:p>
+      <w:r>
+        <w:t>git checkout Eshan/feature/booking</w:t>
+      </w:r>
+    </w:p>
+    <w:p>
+      <w:r>
+        <w:t>git merge main</w:t>
+      </w:r>
+    </w:p>
+    <w:p>
+      <w:pPr>
+        <w:rPr>
+          <w:b/>
+          <w:bCs/>
+        </w:rPr>
+      </w:pPr>
+    </w:p>
+    <w:p>
+      <w:pPr>
+        <w:rPr>
+          <w:b/>
+          <w:bCs/>
+        </w:rPr>
+      </w:pPr>
+      <w:r>
+        <w:rPr>
+          <w:b/>
+          <w:bCs/>
+        </w:rPr>
+        <w:t># 2. Code, then commit locally</w:t>
+      </w:r>
+    </w:p>
+    <w:p>
+      <w:r>
+        <w:t xml:space="preserve">git </w:t>
+      </w:r>
+      <w:proofErr w:type="gramStart"/>
+      <w:r>
+        <w:t>add .</w:t>
+      </w:r>
+      <w:proofErr w:type="gramEnd"/>
+    </w:p>
+    <w:p>
+      <w:r>
+        <w:t>git commit -m "feat: message"</w:t>
+      </w:r>
+    </w:p>
+    <w:p>
+      <w:pPr>
+        <w:rPr>
+          <w:b/>
+          <w:bCs/>
+        </w:rPr>
+      </w:pPr>
+    </w:p>
+    <w:p>
+      <w:pPr>
+        <w:rPr>
+          <w:b/>
+          <w:bCs/>
+        </w:rPr>
+      </w:pPr>
+      <w:r>
+        <w:rPr>
+          <w:b/>
+          <w:bCs/>
+        </w:rPr>
+        <w:t># 3. Push regularly to back up your work</w:t>
+      </w:r>
+    </w:p>
+    <w:p>
+      <w:r>
+        <w:t>git push origin Eshan/feature/booking</w:t>
+      </w:r>
+    </w:p>
+    <w:p>
+      <w:pPr>
+        <w:rPr>
+          <w:b/>
+          <w:bCs/>
+        </w:rPr>
+      </w:pPr>
+    </w:p>
+    <w:p>
+      <w:pPr>
+        <w:rPr>
+          <w:b/>
+          <w:bCs/>
+        </w:rPr>
+      </w:pPr>
+      <w:r>
+        <w:rPr>
+          <w:b/>
+          <w:bCs/>
+        </w:rPr>
+        <w:t># 4. Before creating PR – final sync</w:t>
+      </w:r>
+    </w:p>
+    <w:p>
+      <w:r>
+        <w:t>git checkout main</w:t>
+      </w:r>
+    </w:p>
+    <w:p>
+      <w:r>
+        <w:t>git pull origin main</w:t>
+      </w:r>
+    </w:p>
+    <w:p>
+      <w:r>
+        <w:t>git checkout Eshan/feature/booking</w:t>
+      </w:r>
+    </w:p>
+    <w:p>
+      <w:r>
+        <w:t>git merge main</w:t>
+      </w:r>
+    </w:p>
+    <w:p>
+      <w:r>
+        <w:t>git push origin Eshan/feature/booking</w:t>
+      </w:r>
+    </w:p>
+    <w:p>
+      <w:pPr>
+        <w:rPr>
+          <w:b/>
+          <w:bCs/>
+        </w:rPr>
+      </w:pPr>
+    </w:p>
+    <w:p>
+      <w:pPr>
+        <w:rPr>
+          <w:b/>
+          <w:bCs/>
+        </w:rPr>
+      </w:pPr>
+      <w:r>
+        <w:rPr>
+          <w:b/>
+          <w:bCs/>
+        </w:rPr>
+        <w:t># 5. Create PR on GitHub → merge</w:t>
+      </w:r>
+    </w:p>
+    <w:p/>
+    <w:p>
+      <w:pPr>
+        <w:rPr>
+          <w:b/>
+          <w:bCs/>
+        </w:rPr>
+      </w:pPr>
+      <w:r>
+        <w:rPr>
+          <w:b/>
+          <w:bCs/>
+        </w:rPr>
+        <w:t># 6. After merge, update local main and delete branch</w:t>
+      </w:r>
+    </w:p>
+    <w:p>
+      <w:r>
+        <w:t>git checkout main</w:t>
+      </w:r>
+    </w:p>
+    <w:p>
+      <w:r>
+        <w:t>git pull origin main</w:t>
+      </w:r>
+    </w:p>
+    <w:p>
+      <w:r>
+        <w:lastRenderedPageBreak/>
+        <w:t>git branch -d Eshan/feature/booking</w:t>
+      </w:r>
+    </w:p>
+    <w:p>
+      <w:r>
+        <w:t>git push origin --delete Eshan/feature/booking</w:t>
       </w:r>
     </w:p>
     <w:sectPr>
@@ -3571,7 +3799,6 @@
   <w:style w:type="character" w:default="1" w:styleId="DefaultParagraphFont">
     <w:name w:val="Default Paragraph Font"/>
     <w:uiPriority w:val="1"/>
-    <w:semiHidden/>
     <w:unhideWhenUsed/>
   </w:style>
   <w:style w:type="table" w:default="1" w:styleId="TableNormal">

</xml_diff>